<commit_message>
docs: fix due diligence report blank pages and content layout
</commit_message>
<xml_diff>
--- a/InternPath_Technical_Due_Diligence_Report.docx
+++ b/InternPath_Technical_Due_Diligence_Report.docx
@@ -36,7 +36,7 @@
     </w:p>
     <w:p>
       <w:pPr>
-        <w:spacing w:after="800" w:before="200"/>
+        <w:spacing w:after="60" w:before="200"/>
         <w:jc w:val="center"/>
       </w:pPr>
       <w:r>
@@ -44,25 +44,43 @@
           <w:sz w:val="21"/>
           <w:szCs w:val="21"/>
         </w:rPr>
-        <w:t xml:space="preserve">评估对象: InternPath RAG Pipeline &amp; Agent 编排系统
-</w:t>
-      </w:r>
+        <w:t xml:space="preserve">评估对象: InternPath RAG Pipeline &amp; Agent 编排系统</w:t>
+      </w:r>
+    </w:p>
+    <w:p>
+      <w:pPr>
+        <w:spacing w:after="60"/>
+        <w:jc w:val="center"/>
+      </w:pPr>
       <w:r>
         <w:rPr>
           <w:sz w:val="21"/>
           <w:szCs w:val="21"/>
         </w:rPr>
-        <w:t xml:space="preserve">评估机构: 投资机构 AI 技术尽调 Agent
-</w:t>
-      </w:r>
-      <w:r>
-        <w:rPr>
+        <w:t xml:space="preserve">评估机构: 投资机构 AI 技术尽调 Agent</w:t>
+      </w:r>
+    </w:p>
+    <w:p>
+      <w:pPr>
+        <w:spacing w:after="60"/>
+        <w:jc w:val="center"/>
+      </w:pPr>
+      <w:r>
+        <w:rPr>
+          <w:b/>
+          <w:bCs/>
+          <w:color w:val="A00000"/>
           <w:sz w:val="21"/>
           <w:szCs w:val="21"/>
         </w:rPr>
-        <w:t xml:space="preserve">报告级别: 投资机构机密 (CONFIDENTIAL)
-</w:t>
-      </w:r>
+        <w:t xml:space="preserve">报告级别: 投资机构机密 (CONFIDENTIAL)</w:t>
+      </w:r>
+    </w:p>
+    <w:p>
+      <w:pPr>
+        <w:spacing w:after="400"/>
+        <w:jc w:val="center"/>
+      </w:pPr>
       <w:r>
         <w:rPr>
           <w:sz w:val="21"/>
@@ -78,31 +96,163 @@
     </w:p>
     <w:p>
       <w:pPr>
-        <w:pStyle w:val="Heading1"/>
-      </w:pPr>
-      <w:r>
+        <w:spacing w:after="240" w:before="120"/>
+      </w:pPr>
+      <w:r>
+        <w:rPr>
+          <w:b/>
+          <w:bCs/>
+          <w:color w:val="1A365D"/>
+          <w:sz w:val="28"/>
+          <w:szCs w:val="28"/>
+        </w:rPr>
         <w:t xml:space="preserve">目录 (Table of Contents)</w:t>
       </w:r>
     </w:p>
-    <w:sdt>
-      <w:sdtPr>
-        <w:alias w:val="目录"/>
-      </w:sdtPr>
-      <w:sdtContent>
-        <w:p>
-          <w:r>
-            <w:fldChar w:fldCharType="begin" w:dirty="true"/>
-            <w:instrText xml:space="preserve">TOC \h \o "1-3"</w:instrText>
-            <w:fldChar w:fldCharType="separate"/>
-          </w:r>
-        </w:p>
-        <w:p>
-          <w:r>
-            <w:fldChar w:fldCharType="end"/>
-          </w:r>
-        </w:p>
-      </w:sdtContent>
-    </w:sdt>
+    <w:p>
+      <w:pPr>
+        <w:spacing w:after="80"/>
+      </w:pPr>
+      <w:r>
+        <w:rPr>
+          <w:sz w:val="22"/>
+          <w:szCs w:val="22"/>
+        </w:rPr>
+        <w:t xml:space="preserve">1.  Executive Summary (项目总体定位)</w:t>
+      </w:r>
+    </w:p>
+    <w:p>
+      <w:pPr>
+        <w:spacing w:after="80"/>
+      </w:pPr>
+      <w:r>
+        <w:rPr>
+          <w:sz w:val="22"/>
+          <w:szCs w:val="22"/>
+        </w:rPr>
+        <w:t xml:space="preserve">2.  Architecture Analysis (技术架构深度分析)</w:t>
+      </w:r>
+    </w:p>
+    <w:p>
+      <w:pPr>
+        <w:spacing w:after="80"/>
+      </w:pPr>
+      <w:r>
+        <w:rPr>
+          <w:sz w:val="22"/>
+          <w:szCs w:val="22"/>
+        </w:rPr>
+        <w:t xml:space="preserve">3.  AI System Analysis (AI系统成熟度分析)</w:t>
+      </w:r>
+    </w:p>
+    <w:p>
+      <w:pPr>
+        <w:spacing w:after="80"/>
+      </w:pPr>
+      <w:r>
+        <w:rPr>
+          <w:sz w:val="22"/>
+          <w:szCs w:val="22"/>
+        </w:rPr>
+        <w:t xml:space="preserve">4.  Structured RAG Analysis (结构化 RAG 深度分析)</w:t>
+      </w:r>
+    </w:p>
+    <w:p>
+      <w:pPr>
+        <w:spacing w:after="80"/>
+      </w:pPr>
+      <w:r>
+        <w:rPr>
+          <w:sz w:val="22"/>
+          <w:szCs w:val="22"/>
+        </w:rPr>
+        <w:t xml:space="preserve">5.  Workflow &amp; Agent Analysis (工作流与智能体编排分析)</w:t>
+      </w:r>
+    </w:p>
+    <w:p>
+      <w:pPr>
+        <w:spacing w:after="80"/>
+      </w:pPr>
+      <w:r>
+        <w:rPr>
+          <w:sz w:val="22"/>
+          <w:szCs w:val="22"/>
+        </w:rPr>
+        <w:t xml:space="preserve">6.  AI Governance Analysis (可信 AI 治理与审计)</w:t>
+      </w:r>
+    </w:p>
+    <w:p>
+      <w:pPr>
+        <w:spacing w:after="80"/>
+      </w:pPr>
+      <w:r>
+        <w:rPr>
+          <w:sz w:val="22"/>
+          <w:szCs w:val="22"/>
+        </w:rPr>
+        <w:t xml:space="preserve">7.  Engineering Analysis (工程能力评估)</w:t>
+      </w:r>
+    </w:p>
+    <w:p>
+      <w:pPr>
+        <w:spacing w:after="80"/>
+      </w:pPr>
+      <w:r>
+        <w:rPr>
+          <w:sz w:val="22"/>
+          <w:szCs w:val="22"/>
+        </w:rPr>
+        <w:t xml:space="preserve">8.  Scalability Analysis (性能与扩展性分析)</w:t>
+      </w:r>
+    </w:p>
+    <w:p>
+      <w:pPr>
+        <w:spacing w:after="80"/>
+      </w:pPr>
+      <w:r>
+        <w:rPr>
+          <w:sz w:val="22"/>
+          <w:szCs w:val="22"/>
+        </w:rPr>
+        <w:t xml:space="preserve">9.  Commercial Analysis (商业化潜力分析)</w:t>
+      </w:r>
+    </w:p>
+    <w:p>
+      <w:pPr>
+        <w:spacing w:after="80"/>
+      </w:pPr>
+      <w:r>
+        <w:rPr>
+          <w:sz w:val="22"/>
+          <w:szCs w:val="22"/>
+        </w:rPr>
+        <w:t xml:space="preserve">10. Investment Risks (投资风险分析)</w:t>
+      </w:r>
+    </w:p>
+    <w:p>
+      <w:pPr>
+        <w:spacing w:after="80"/>
+      </w:pPr>
+      <w:r>
+        <w:rPr>
+          <w:sz w:val="22"/>
+          <w:szCs w:val="22"/>
+        </w:rPr>
+        <w:t xml:space="preserve">11. Recommended Next Steps (下一阶段重构路线图)</w:t>
+      </w:r>
+    </w:p>
+    <w:p>
+      <w:pPr>
+        <w:spacing w:after="80"/>
+      </w:pPr>
+      <w:r>
+        <w:rPr>
+          <w:sz w:val="22"/>
+          <w:szCs w:val="22"/>
+        </w:rPr>
+        <w:t xml:space="preserve">12. Final Rating (尽调最终综合评级)</w:t>
+      </w:r>
+    </w:p>
     <w:p>
       <w:r>
         <w:br w:type="page"/>
@@ -492,11 +642,62 @@
     </w:p>
     <w:p>
       <w:r>
-        <w:t xml:space="preserve">判断依据与成熟度原因：
-</w:t>
-      </w:r>
-      <w:r>
-        <w:t xml:space="preserve">系统已经完全跨越了 Demo 玩具阶段，并拥有接近生产级别的防御能力。它提供了白盒化的 RAG 可观测性分析面板（workflowLogs）、硬性的事实可信门禁逻辑（Quality Gate），并且对于极端大模型响应超时或服务离线有健壮的 Fallback 降级词频逻辑。这使其具备了企业级落地能力，唯独缺乏分布式存储与高负载智能体调度能力。</w:t>
+        <w:rPr>
+          <w:b/>
+          <w:bCs/>
+        </w:rPr>
+        <w:t xml:space="preserve">判断依据与成熟度原因：</w:t>
+      </w:r>
+    </w:p>
+    <w:p>
+      <w:pPr>
+        <w:pStyle w:val="ListParagraph"/>
+        <w:numPr>
+          <w:ilvl w:val="0"/>
+          <w:numId w:val="3"/>
+        </w:numPr>
+        <w:spacing w:after="80" w:before="80"/>
+      </w:pPr>
+      <w:r>
+        <w:rPr>
+          <w:sz w:val="23"/>
+          <w:szCs w:val="23"/>
+        </w:rPr>
+        <w:t xml:space="preserve">系统已经完全跨越了 Demo 玩具阶段，并拥有接近生产级别的防御能力。</w:t>
+      </w:r>
+    </w:p>
+    <w:p>
+      <w:pPr>
+        <w:pStyle w:val="ListParagraph"/>
+        <w:numPr>
+          <w:ilvl w:val="0"/>
+          <w:numId w:val="3"/>
+        </w:numPr>
+        <w:spacing w:after="80" w:before="80"/>
+      </w:pPr>
+      <w:r>
+        <w:rPr>
+          <w:sz w:val="23"/>
+          <w:szCs w:val="23"/>
+        </w:rPr>
+        <w:t xml:space="preserve">它提供了白盒化的 RAG 可观测性分析面板（workflowLogs）、硬性的事实可信门禁逻辑（Quality Gate）。</w:t>
+      </w:r>
+    </w:p>
+    <w:p>
+      <w:pPr>
+        <w:pStyle w:val="ListParagraph"/>
+        <w:numPr>
+          <w:ilvl w:val="0"/>
+          <w:numId w:val="3"/>
+        </w:numPr>
+        <w:spacing w:after="80" w:before="80"/>
+      </w:pPr>
+      <w:r>
+        <w:rPr>
+          <w:sz w:val="23"/>
+          <w:szCs w:val="23"/>
+        </w:rPr>
+        <w:t xml:space="preserve">对于极端大模型响应超时或服务离线有健壮的 Fallback 降级词频逻辑，使其具备了企业级落地能力，唯独缺乏分布式存储与高负载智能体调度能力。</w:t>
       </w:r>
     </w:p>
     <w:p>
@@ -623,16 +824,54 @@
       </w:r>
     </w:p>
     <w:p>
-      <w:r>
-        <w:t xml:space="preserve">1. 目前的工作流属于经典的静态有向无环图 (Static DAG)，状态线性流动，尚不具备真正的 LLM 动态自适应路由和多并发协作特征。
-</w:t>
-      </w:r>
-      <w:r>
-        <w:t xml:space="preserve">2. 系统极度适合升级到 LangGraph，因为其天然的“生成-检验-驳回重写-通过”的校验机制非常契合 Graph 结构的反思循环 (Reflection loop) 模式。
-</w:t>
-      </w:r>
-      <w:r>
-        <w:t xml:space="preserve">3. 系统中如 Section Parser 等节点具备极高的内聚性，是天然的 MCP (Model Context Protocol) 工具箱，非常有利于未来直接作为 Tool Calling 接入主流 Agent 生态。</w:t>
+      <w:pPr>
+        <w:pStyle w:val="ListParagraph"/>
+        <w:numPr>
+          <w:ilvl w:val="0"/>
+          <w:numId w:val="4"/>
+        </w:numPr>
+        <w:spacing w:after="80" w:before="80"/>
+      </w:pPr>
+      <w:r>
+        <w:rPr>
+          <w:sz w:val="23"/>
+          <w:szCs w:val="23"/>
+        </w:rPr>
+        <w:t xml:space="preserve">目前的工作流属于经典的静态有向无环图 (Static DAG)，状态线性流动，尚不具备真正的 LLM 动态自适应路由和多并发协作特征。</w:t>
+      </w:r>
+    </w:p>
+    <w:p>
+      <w:pPr>
+        <w:pStyle w:val="ListParagraph"/>
+        <w:numPr>
+          <w:ilvl w:val="0"/>
+          <w:numId w:val="4"/>
+        </w:numPr>
+        <w:spacing w:after="80" w:before="80"/>
+      </w:pPr>
+      <w:r>
+        <w:rPr>
+          <w:sz w:val="23"/>
+          <w:szCs w:val="23"/>
+        </w:rPr>
+        <w:t xml:space="preserve">系统极度适合升级到 LangGraph，因为其天然的“生成-检验-驳回重写-通过”的校验机制非常契合 Graph 结构的反思循环 (Reflection loop) 模式。</w:t>
+      </w:r>
+    </w:p>
+    <w:p>
+      <w:pPr>
+        <w:pStyle w:val="ListParagraph"/>
+        <w:numPr>
+          <w:ilvl w:val="0"/>
+          <w:numId w:val="4"/>
+        </w:numPr>
+        <w:spacing w:after="80" w:before="80"/>
+      </w:pPr>
+      <w:r>
+        <w:rPr>
+          <w:sz w:val="23"/>
+          <w:szCs w:val="23"/>
+        </w:rPr>
+        <w:t xml:space="preserve">系统中如 Section Parser 等节点具备极高的内聚性，是天然的 MCP (Model Context Protocol) 工具箱，非常有利于未来直接作为 Tool Calling 接入主流 Agent 生态。</w:t>
       </w:r>
     </w:p>
     <w:p>

</xml_diff>